<commit_message>
changed navigation pannel for home and other pages
</commit_message>
<xml_diff>
--- a/docs/assets/research/digital-twin.docx
+++ b/docs/assets/research/digital-twin.docx
@@ -123,7 +123,22 @@
         <w:rPr>
           <w:rFonts w:ascii="Times New Roman" w:hAnsi="Times New Roman" w:cs="Times New Roman"/>
         </w:rPr>
-        <w:t xml:space="preserve">On 29 September 2025, Bangladesh Energy and Power Research Council (BEPRC) hosted the contract signing ceremony for the transformative and visionary project titled “DEVELOPMENT OF AN ARTIFICIAL INTELLIGENCE ENABLED DIGITAL TWIN OF A SOLAR PHOTOVOLTAIC PLANT TO ENHANCE RENEWABLE PENETRATION IN POWER GRID OF BANGLADESH.” An agreement was signed between the BEPRC and MIST through Major Shah Mohazzem Hossain, PhD, Signals, Instructor Class B, Department of EECE, MIST, who will serve as the Principal Investigator (PI) of this three-year research project with a total budget allocation of BDT 1.63 crore; the project team of EECE Dept includes Major Mohammad Naim Uddin, Signals, and Assistant Professor Md. Ahsan Kabir as Co-PIs, while Assistant Professor Hasan Monir will act as the Lead Research Engineer, collectively bringing together strong </w:t>
+        <w:t>On 29 September 2025, Bangladesh Energy and Power Research Council (BEPRC) hosted the contract signing ceremony for the transformative and visionary project titled “</w:t>
+      </w:r>
+      <w:hyperlink r:id="rId6" w:history="1">
+        <w:r>
+          <w:rPr>
+            <w:rStyle w:val="Hyperlink"/>
+            <w:rFonts w:ascii="Times New Roman" w:hAnsi="Times New Roman" w:cs="Times New Roman"/>
+          </w:rPr>
+          <w:t>DEVELOPMENT OF AN ARTIFICIAL INTELLIGENCE ENABLED DIGITAL TWIN OF A SOLAR PHOTOVOLTAIC PLANT TO ENHANCE RENEWABLE PENETRATION IN POWER GRID OF BANGLADESH</w:t>
+        </w:r>
+      </w:hyperlink>
+      <w:r>
+        <w:rPr>
+          <w:rFonts w:ascii="Times New Roman" w:hAnsi="Times New Roman" w:cs="Times New Roman"/>
+        </w:rPr>
+        <w:t xml:space="preserve">.” An agreement was signed between the BEPRC and MIST through Major Shah Mohazzem Hossain, PhD, Signals, Instructor Class B, Department of EECE, MIST, who will serve as the Principal Investigator (PI) of this three-year research project with a total budget allocation of BDT 1.63 crore; the project team of EECE Dept includes Major Mohammad Naim Uddin, Signals, and Assistant Professor Md. Ahsan Kabir as Co-PIs, while Assistant Professor Hasan Monir will act as the Lead Research Engineer, collectively bringing together strong </w:t>
       </w:r>
       <w:r>
         <w:rPr>
@@ -546,6 +561,7 @@
   <w:style w:type="character" w:default="1" w:styleId="DefaultParagraphFont">
     <w:name w:val="Default Paragraph Font"/>
     <w:uiPriority w:val="1"/>
+    <w:semiHidden/>
     <w:unhideWhenUsed/>
   </w:style>
   <w:style w:type="table" w:default="1" w:styleId="TableNormal">
@@ -568,6 +584,29 @@
     <w:uiPriority w:val="99"/>
     <w:semiHidden/>
     <w:unhideWhenUsed/>
+  </w:style>
+  <w:style w:type="character" w:styleId="Hyperlink">
+    <w:name w:val="Hyperlink"/>
+    <w:basedOn w:val="DefaultParagraphFont"/>
+    <w:uiPriority w:val="99"/>
+    <w:unhideWhenUsed/>
+    <w:rsid w:val="000E02DF"/>
+    <w:rPr>
+      <w:color w:val="0563C1" w:themeColor="hyperlink"/>
+      <w:u w:val="single"/>
+    </w:rPr>
+  </w:style>
+  <w:style w:type="character" w:styleId="UnresolvedMention">
+    <w:name w:val="Unresolved Mention"/>
+    <w:basedOn w:val="DefaultParagraphFont"/>
+    <w:uiPriority w:val="99"/>
+    <w:semiHidden/>
+    <w:unhideWhenUsed/>
+    <w:rsid w:val="000E02DF"/>
+    <w:rPr>
+      <w:color w:val="605E5C"/>
+      <w:shd w:val="clear" w:color="auto" w:fill="E1DFDD"/>
+    </w:rPr>
   </w:style>
 </w:styles>
 </file>

</xml_diff>